<commit_message>
feat: add document API collab example
</commit_message>
<xml_diff>
--- a/examples/collaboration/superdoc-yjs/public/sample-document.docx
+++ b/examples/collaboration/superdoc-yjs/public/sample-document.docx
@@ -2,834 +2,10 @@
 <file path=word/document.xml><?xml version="1.0" encoding="utf-8"?>
 <w:document xmlns:wpc="http://schemas.microsoft.com/office/word/2010/wordprocessingCanvas" xmlns:cx="http://schemas.microsoft.com/office/drawing/2014/chartex" xmlns:cx1="http://schemas.microsoft.com/office/drawing/2015/9/8/chartex" xmlns:cx2="http://schemas.microsoft.com/office/drawing/2015/10/21/chartex" xmlns:cx3="http://schemas.microsoft.com/office/drawing/2016/5/9/chartex" xmlns:cx4="http://schemas.microsoft.com/office/drawing/2016/5/10/chartex" xmlns:cx5="http://schemas.microsoft.com/office/drawing/2016/5/11/chartex" xmlns:cx6="http://schemas.microsoft.com/office/drawing/2016/5/12/chartex" xmlns:cx7="http://schemas.microsoft.com/office/drawing/2016/5/13/chartex" xmlns:cx8="http://schemas.microsoft.com/office/drawing/2016/5/14/chartex" xmlns:mc="http://schemas.openxmlformats.org/markup-compatibility/2006" xmlns:aink="http://schemas.microsoft.com/office/drawing/2016/ink" xmlns:am3d="http://schemas.microsoft.com/office/drawing/2017/model3d" xmlns:o="urn:schemas-microsoft-com:office:office" xmlns:oel="http://schemas.microsoft.com/office/2019/extlst" xmlns:r="http://schemas.openxmlformats.org/officeDocument/2006/relationships" xmlns:m="http://schemas.openxmlformats.org/officeDocument/2006/math" xmlns:v="urn:schemas-microsoft-com:vml" xmlns:wp14="http://schemas.microsoft.com/office/word/2010/wordprocessingDrawing" xmlns:wp="http://schemas.openxmlformats.org/drawingml/2006/wordprocessingDrawing" xmlns:w10="urn:schemas-microsoft-com:office:word" xmlns:w="http://schemas.openxmlformats.org/wordprocessingml/2006/main" xmlns:w14="http://schemas.microsoft.com/office/word/2010/wordml" xmlns:w15="http://schemas.microsoft.com/office/word/2012/wordml" xmlns:w16cex="http://schemas.microsoft.com/office/word/2018/wordml/cex" xmlns:w16cid="http://schemas.microsoft.com/office/word/2016/wordml/cid" xmlns:w16="http://schemas.microsoft.com/office/word/2018/wordml" xmlns:w16du="http://schemas.microsoft.com/office/word/2023/wordml/word16du" xmlns:w16sdtdh="http://schemas.microsoft.com/office/word/2020/wordml/sdtdatahash" xmlns:w16sdtfl="http://schemas.microsoft.com/office/word/2024/wordml/sdtformatlock" xmlns:w16se="http://schemas.microsoft.com/office/word/2015/wordml/symex" xmlns:wpg="http://schemas.microsoft.com/office/word/2010/wordprocessingGroup" xmlns:wpi="http://schemas.microsoft.com/office/word/2010/wordprocessingInk" xmlns:wne="http://schemas.microsoft.com/office/word/2006/wordml" xmlns:wps="http://schemas.microsoft.com/office/word/2010/wordprocessingShape" mc:Ignorable="w14 w15 w16se w16cid w16 w16cex w16sdtdh w16sdtfl w16du wp14">
   <w:body>
-    <w:p>
-      <w:pPr>
-        <w:pStyle w:val="Body"/>
-        <w:spacing w:lineRule="auto"/>
-        <w:ind w:left="0"/>
-      </w:pPr>
-      <w:r>
-        <w:rPr>
-          <w:color w:val="999999"/>
-          <w:rFonts w:ascii="Roboto Light" w:eastAsia="Roboto Light" w:hAnsi="Roboto Light" w:cs="Roboto Light"/>
-          <w:sz w:val="32"/>
-        </w:rPr>
-        <w:t>Press release</w:t>
-      </w:r>
-    </w:p>
-    <w:p>
-      <w:pPr>
-        <w:pStyle w:val="Body"/>
-        <w:spacing w:lineRule="auto"/>
-        <w:ind w:left="0"/>
-      </w:pPr>
-      <w:r>
-        <w:rPr>
-          <w:b/>
-          <w:color w:val="000000"/>
-          <w:rFonts w:ascii="Roboto" w:eastAsia="Roboto" w:hAnsi="Roboto" w:cs="Roboto"/>
-          <w:sz w:val="44"/>
-        </w:rPr>
-        <w:t>Harbour launches collaborative</w:t>
-      </w:r>
-      <w:del w:id="0" w:author="Superdoc User" w:authorEmail="" w:date="2024-12-20T04:20:00Z">
-        <w:r>
-          <w:rPr>
-            <w:b/>
-            <w:color w:val="000000"/>
-            <w:rFonts w:ascii="Roboto" w:eastAsia="Roboto" w:hAnsi="Roboto" w:cs="Roboto"/>
-            <w:sz w:val="44"/>
-          </w:rPr>
-          <w:delText xml:space="preserve"> DOCX</w:delText>
-        </w:r>
-      </w:del>
-      <w:r>
-        <w:rPr>
-          <w:b/>
-          <w:color w:val="000000"/>
-          <w:rFonts w:ascii="Roboto" w:eastAsia="Roboto" w:hAnsi="Roboto" w:cs="Roboto"/>
-          <w:sz w:val="44"/>
-        </w:rPr>
-        <w:t xml:space="preserve"> </w:t>
-      </w:r>
-      <w:ins w:id="1" w:author="Superdoc User" w:authorEmail="" w:date="2024-12-20T04:20:00Z">
-        <w:r>
-          <w:rPr>
-            <w:b/>
-            <w:color w:val="000000"/>
-            <w:rFonts w:ascii="Roboto" w:eastAsia="Roboto" w:hAnsi="Roboto" w:cs="Roboto"/>
-            <w:sz w:val="44"/>
-          </w:rPr>
-          <w:t>web native document</w:t>
-        </w:r>
-      </w:ins>
-      <w:r>
-        <w:rPr>
-          <w:b/>
-          <w:color w:val="000000"/>
-          <w:rFonts w:ascii="Roboto" w:eastAsia="Roboto" w:hAnsi="Roboto" w:cs="Roboto"/>
-          <w:sz w:val="44"/>
-        </w:rPr>
-        <w:t xml:space="preserve"> editing for contracts</w:t>
-      </w:r>
-    </w:p>
-    <w:p>
-      <w:pPr>
-        <w:pStyle w:val="Body"/>
-        <w:spacing w:lineRule="auto"/>
-        <w:ind w:left="0"/>
-      </w:pPr>
-      <w:r>
-        <w:rPr>
-          <w:color w:val="000000"/>
-          <w:rFonts w:ascii="Arial" w:eastAsia="Arial" w:hAnsi="Arial" w:cs="Arial"/>
-          <w:sz w:val="22"/>
-        </w:rPr>
-        <w:t xml:space="preserve">For all the capabilities of the modern browser, </w:t>
-      </w:r>
-      <w:del w:id="2" w:author="Superdoc User" w:authorEmail="" w:date="2024-12-20T04:30:00Z">
-        <w:r>
-          <w:rPr>
-            <w:color w:val="000000"/>
-            <w:rFonts w:ascii="Arial" w:eastAsia="Arial" w:hAnsi="Arial" w:cs="Arial"/>
-            <w:sz w:val="22"/>
-          </w:rPr>
-          <w:delText>the online editing of a DOCX file is still a pain</w:delText>
-        </w:r>
-      </w:del>
-      <w:ins w:id="3" w:author="Superdoc User" w:authorEmail="" w:date="2024-12-20T04:30:00Z">
-        <w:r>
-          <w:rPr>
-            <w:color w:val="000000"/>
-            <w:rFonts w:ascii="Arial" w:eastAsia="Arial" w:hAnsi="Arial" w:cs="Arial"/>
-            <w:sz w:val="22"/>
-          </w:rPr>
-          <w:t xml:space="preserve">the </w:t>
-        </w:r>
-      </w:ins>
-      <w:ins w:id="4" w:author="Superdoc User" w:authorEmail="" w:date="2024-12-20T04:40:00Z">
-        <w:r>
-          <w:rPr>
-            <w:color w:val="000000"/>
-            <w:rFonts w:ascii="Arial" w:eastAsia="Arial" w:hAnsi="Arial" w:cs="Arial"/>
-            <w:sz w:val="22"/>
-          </w:rPr>
-          <w:t>experience of editing documents on the web continues to be difficult</w:t>
-        </w:r>
-      </w:ins>
-      <w:r>
-        <w:rPr>
-          <w:color w:val="000000"/>
-          <w:rFonts w:ascii="Arial" w:eastAsia="Arial" w:hAnsi="Arial" w:cs="Arial"/>
-          <w:sz w:val="22"/>
-        </w:rPr>
-        <w:t>. This is especially true when needing to embed a collaborative document editor inside one’s own web application.</w:t>
-      </w:r>
-    </w:p>
-    <w:p>
-      <w:pPr>
-        <w:pStyle w:val="Body"/>
-        <w:spacing w:lineRule="auto"/>
-        <w:ind w:left="0"/>
-      </w:pPr>
-    </w:p>
-    <w:p>
-      <w:pPr>
-        <w:pStyle w:val="Body"/>
-        <w:spacing w:lineRule="auto"/>
-        <w:ind w:left="0"/>
-      </w:pPr>
-      <w:r>
-        <w:rPr>
-          <w:color w:val="000000"/>
-          <w:rFonts w:ascii="Arial" w:eastAsia="Arial" w:hAnsi="Arial" w:cs="Arial"/>
-          <w:sz w:val="22"/>
-        </w:rPr>
-        <w:t xml:space="preserve">Enter </w:t>
-      </w:r>
-      <w:hyperlink w:history="0" r:id="rId7">
-        <w:r>
-          <w:rPr>
-            <w:color w:val="000000"/>
-            <w:rFonts w:ascii="Arial" w:eastAsia="Arial" w:hAnsi="Arial" w:cs="Arial"/>
-            <w:sz w:val="22"/>
-            <w:rStyle w:val="Hyperlink"/>
-            <w:u w:val="single"/>
-          </w:rPr>
-          <w:t>Harbour</w:t>
-        </w:r>
-      </w:hyperlink>
-      <w:r>
-        <w:rPr>
-          <w:color w:val="000000"/>
-          <w:rFonts w:ascii="Arial" w:eastAsia="Arial" w:hAnsi="Arial" w:cs="Arial"/>
-          <w:sz w:val="22"/>
-        </w:rPr>
-        <w:t xml:space="preserve"> – a company specializing in business collaboration tools for contracts – who just introduced native DOCX editing for the web named SuperDoc. When the team could not find an existing solution meeting the needs of modern businesses, they knew they had to build it themselves. The goal is a modern, </w:t>
-      </w:r>
-      <w:r>
-        <w:rPr>
-          <w:color w:val="000000"/>
-          <w:rFonts w:ascii="Arial" w:eastAsia="Arial" w:hAnsi="Arial" w:cs="Arial"/>
-          <w:sz w:val="22"/>
-        </w:rPr>
-        <w:t>open source</w:t>
-      </w:r>
-      <w:r>
-        <w:rPr>
-          <w:color w:val="000000"/>
-          <w:rFonts w:ascii="Arial" w:eastAsia="Arial" w:hAnsi="Arial" w:cs="Arial"/>
-          <w:sz w:val="22"/>
-        </w:rPr>
-        <w:t xml:space="preserve"> document editing experience that provides pristine DOCX formatting upon import/export and empowers real-time collaboration. How the document looks offline and online is exactly how it looks when imported or exported.</w:t>
-      </w:r>
-    </w:p>
-    <w:p>
-      <w:pPr>
-        <w:pStyle w:val="Body"/>
-        <w:spacing w:lineRule="auto"/>
-        <w:ind w:left="0"/>
-      </w:pPr>
-    </w:p>
-    <w:p>
-      <w:pPr>
-        <w:pStyle w:val="Body"/>
-        <w:spacing w:lineRule="auto"/>
-        <w:ind w:left="0"/>
-      </w:pPr>
-      <w:r>
-        <w:rPr>
-          <w:b/>
-          <w:color w:val="000000"/>
-          <w:rFonts w:ascii="Arial" w:eastAsia="Arial" w:hAnsi="Arial" w:cs="Arial"/>
-          <w:sz w:val="22"/>
-        </w:rPr>
-        <w:t>Why did we build this?</w:t>
-      </w:r>
-    </w:p>
-    <w:p>
-      <w:pPr>
-        <w:pStyle w:val="Body"/>
-        <w:spacing w:lineRule="auto"/>
-        <w:ind w:left="0"/>
-      </w:pPr>
-    </w:p>
-    <w:p>
-      <w:pPr>
-        <w:pStyle w:val="Body"/>
-        <w:spacing w:lineRule="auto"/>
-        <w:ind w:left="0"/>
-      </w:pPr>
-      <w:r>
-        <w:rPr>
-          <w:color w:val="000000"/>
-          <w:rFonts w:ascii="Arial" w:eastAsia="Arial" w:hAnsi="Arial" w:cs="Arial"/>
-          <w:sz w:val="22"/>
-        </w:rPr>
-        <w:t xml:space="preserve">Harbour is acutely aware of the challenges around bringing online document editing to your own web application since </w:t>
-      </w:r>
-      <w:ins w:id="5" w:author="Superdoc User" w:authorEmail="" w:date="2024-12-20T04:30:00Z">
-        <w:r>
-          <w:rPr>
-            <w:color w:val="000000"/>
-            <w:rFonts w:ascii="Arial" w:eastAsia="Arial" w:hAnsi="Arial" w:cs="Arial"/>
-            <w:sz w:val="22"/>
-          </w:rPr>
-          <w:t xml:space="preserve">many of </w:t>
-        </w:r>
-      </w:ins>
-      <w:r>
-        <w:rPr>
-          <w:color w:val="000000"/>
-          <w:rFonts w:ascii="Arial" w:eastAsia="Arial" w:hAnsi="Arial" w:cs="Arial"/>
-          <w:sz w:val="22"/>
-        </w:rPr>
-        <w:t xml:space="preserve">its customers are modern legal teams. Their customers need to go from document drafted to signed as quickly as possible, which requires streamlining their version tracking, approval workflows and integrations in the process. </w:t>
-      </w:r>
-    </w:p>
-    <w:p>
-      <w:pPr>
-        <w:pStyle w:val="Body"/>
-        <w:spacing w:lineRule="auto"/>
-        <w:ind w:left="0"/>
-      </w:pPr>
-    </w:p>
-    <w:p>
-      <w:pPr>
-        <w:pStyle w:val="Body"/>
-        <w:spacing w:lineRule="auto"/>
-        <w:ind w:left="0"/>
-      </w:pPr>
-      <w:r>
-        <w:rPr>
-          <w:color w:val="000000"/>
-          <w:rFonts w:ascii="Arial" w:eastAsia="Arial" w:hAnsi="Arial" w:cs="Arial"/>
-          <w:sz w:val="22"/>
-        </w:rPr>
-        <w:t>Documents can now be imported and exported with precise formatting, while easily editing, collaborating, approving, and automation of the processes surrounding these documents (e.g., Salesforce updates, background checks, Google Sheets project tracking, and much more) are all made possible by SuperDoc.</w:t>
-      </w:r>
-    </w:p>
-    <w:p>
-      <w:pPr>
-        <w:pStyle w:val="Body"/>
-        <w:spacing w:lineRule="auto"/>
-        <w:ind w:left="0"/>
-      </w:pPr>
-    </w:p>
-    <w:p>
-      <w:pPr>
-        <w:pStyle w:val="Body"/>
-        <w:spacing w:lineRule="auto"/>
-        <w:ind w:left="0"/>
-      </w:pPr>
-      <w:r>
-        <w:rPr>
-          <w:b/>
-          <w:color w:val="000000"/>
-          <w:rFonts w:ascii="Arial" w:eastAsia="Arial" w:hAnsi="Arial" w:cs="Arial"/>
-          <w:sz w:val="22"/>
-        </w:rPr>
-        <w:t>Key differences</w:t>
-      </w:r>
-    </w:p>
-    <w:p>
-      <w:pPr>
-        <w:pStyle w:val="Body"/>
-        <w:spacing w:lineRule="auto"/>
-        <w:ind w:left="0"/>
-      </w:pPr>
-    </w:p>
-    <w:p>
-      <w:pPr>
-        <w:pStyle w:val="Body"/>
-        <w:spacing w:lineRule="auto"/>
-        <w:ind w:left="0"/>
-      </w:pPr>
-      <w:r>
-        <w:rPr>
-          <w:i/>
-          <w:color w:val="000000"/>
-          <w:rFonts w:ascii="Arial" w:eastAsia="Arial" w:hAnsi="Arial" w:cs="Arial"/>
-          <w:sz w:val="22"/>
-        </w:rPr>
-        <w:t>Formatting quality</w:t>
-      </w:r>
-    </w:p>
-    <w:p>
-      <w:pPr>
-        <w:pStyle w:val="Body"/>
-        <w:spacing w:lineRule="auto"/>
-        <w:ind w:left="0"/>
-      </w:pPr>
-    </w:p>
-    <w:p>
-      <w:pPr>
-        <w:pStyle w:val="Body"/>
-        <w:spacing w:lineRule="auto"/>
-        <w:ind w:left="0"/>
-      </w:pPr>
-      <w:r>
-        <w:rPr>
-          <w:color w:val="000000"/>
-          <w:rFonts w:ascii="Arial" w:eastAsia="Arial" w:hAnsi="Arial" w:cs="Arial"/>
-          <w:sz w:val="22"/>
-        </w:rPr>
-        <w:t>In previous attempts at this, the “document editors” provided by other companies just use an internal intermediate format or HTML pretending to look like a DOCX file and then just-at-the-end send the output into an inconsistent conversion service which mangles the formatting of the final exported document, leading to wasted time and work to spot and correct these differences.</w:t>
-      </w:r>
-    </w:p>
-    <w:p>
-      <w:pPr>
-        <w:pStyle w:val="Body"/>
-        <w:spacing w:lineRule="auto"/>
-        <w:ind w:left="0"/>
-      </w:pPr>
-    </w:p>
-    <w:p>
-      <w:pPr>
-        <w:pStyle w:val="Body"/>
-        <w:spacing w:lineRule="auto"/>
-        <w:ind w:left="0"/>
-      </w:pPr>
-      <w:r>
-        <w:rPr>
-          <w:color w:val="000000"/>
-          <w:rFonts w:ascii="Arial" w:eastAsia="Arial" w:hAnsi="Arial" w:cs="Arial"/>
-          <w:sz w:val="22"/>
-        </w:rPr>
-        <w:t xml:space="preserve">For the first time, </w:t>
-      </w:r>
-      <w:r>
-        <w:rPr>
-          <w:color w:val="000000"/>
-          <w:rFonts w:ascii="Arial" w:eastAsia="Arial" w:hAnsi="Arial" w:cs="Arial"/>
-          <w:sz w:val="22"/>
-        </w:rPr>
-        <w:t>Harbour’s</w:t>
-      </w:r>
-      <w:r>
-        <w:rPr>
-          <w:color w:val="000000"/>
-          <w:rFonts w:ascii="Arial" w:eastAsia="Arial" w:hAnsi="Arial" w:cs="Arial"/>
-          <w:sz w:val="22"/>
-        </w:rPr>
-        <w:t xml:space="preserve"> SuperDoc provides truly web-native DOCX editing where each edit immediately and directly saves into the actual underlying DOCX file </w:t>
-      </w:r>
-      <w:r>
-        <w:rPr>
-          <w:color w:val="000000"/>
-          <w:rFonts w:ascii="Arial" w:eastAsia="Arial" w:hAnsi="Arial" w:cs="Arial"/>
-          <w:sz w:val="22"/>
-        </w:rPr>
-        <w:t>–  delivering</w:t>
-      </w:r>
-      <w:r>
-        <w:rPr>
-          <w:color w:val="000000"/>
-          <w:rFonts w:ascii="Arial" w:eastAsia="Arial" w:hAnsi="Arial" w:cs="Arial"/>
-          <w:sz w:val="22"/>
-        </w:rPr>
-        <w:t xml:space="preserve"> excellent formatting quality for the important-and-nuanced needs of real-word documents: preserving lists, columns, line spacing, headers/footers, tables, comments, and more.</w:t>
-      </w:r>
-      <w:r>
-        <w:rPr>
-          <w:b/>
-          <w:color w:val="000000"/>
-          <w:rFonts w:ascii="Arial" w:eastAsia="Arial" w:hAnsi="Arial" w:cs="Arial"/>
-          <w:sz w:val="22"/>
-        </w:rPr>
-        <w:t xml:space="preserve"> How the document looks online is exactly how it looks when exported.</w:t>
-      </w:r>
-    </w:p>
-    <w:p>
-      <w:pPr>
-        <w:pStyle w:val="Body"/>
-        <w:spacing w:lineRule="auto"/>
-        <w:ind w:left="0"/>
-      </w:pPr>
-    </w:p>
-    <w:p>
-      <w:pPr>
-        <w:pStyle w:val="Body"/>
-        <w:spacing w:lineRule="auto"/>
-        <w:ind w:left="0"/>
-      </w:pPr>
-      <w:r>
-        <w:rPr>
-          <w:i/>
-          <w:color w:val="000000"/>
-          <w:rFonts w:ascii="Arial" w:eastAsia="Arial" w:hAnsi="Arial" w:cs="Arial"/>
-          <w:sz w:val="22"/>
-        </w:rPr>
-        <w:t>Bring-your-own-backend collaboration</w:t>
-      </w:r>
-    </w:p>
-    <w:p>
-      <w:pPr>
-        <w:pStyle w:val="Body"/>
-        <w:spacing w:lineRule="auto"/>
-        <w:ind w:left="0"/>
-      </w:pPr>
-    </w:p>
-    <w:p>
-      <w:pPr>
-        <w:pStyle w:val="Body"/>
-        <w:spacing w:lineRule="auto"/>
-        <w:ind w:left="0"/>
-      </w:pPr>
-      <w:r>
-        <w:rPr>
-          <w:color w:val="000000"/>
-          <w:rFonts w:ascii="Arial" w:eastAsia="Arial" w:hAnsi="Arial" w:cs="Arial"/>
-          <w:sz w:val="22"/>
-        </w:rPr>
-        <w:t xml:space="preserve">On top of that foundation, </w:t>
-      </w:r>
-      <w:r>
-        <w:rPr>
-          <w:color w:val="000000"/>
-          <w:rFonts w:ascii="Arial" w:eastAsia="Arial" w:hAnsi="Arial" w:cs="Arial"/>
-          <w:sz w:val="22"/>
-        </w:rPr>
-        <w:t>Harbour's</w:t>
-      </w:r>
-      <w:r>
-        <w:rPr>
-          <w:color w:val="000000"/>
-          <w:rFonts w:ascii="Arial" w:eastAsia="Arial" w:hAnsi="Arial" w:cs="Arial"/>
-          <w:sz w:val="22"/>
-        </w:rPr>
-        <w:t xml:space="preserve"> workflows get amplified with secure, fast, real-time collaboration including live editing with granular </w:t>
-      </w:r>
-      <w:r>
-        <w:rPr>
-          <w:color w:val="000000"/>
-          <w:rFonts w:ascii="Arial" w:eastAsia="Arial" w:hAnsi="Arial" w:cs="Arial"/>
-          <w:sz w:val="22"/>
-        </w:rPr>
-        <w:t>permissioning</w:t>
-      </w:r>
-      <w:r>
-        <w:rPr>
-          <w:color w:val="000000"/>
-          <w:rFonts w:ascii="Arial" w:eastAsia="Arial" w:hAnsi="Arial" w:cs="Arial"/>
-          <w:sz w:val="22"/>
-        </w:rPr>
-        <w:t xml:space="preserve"> and tracked changes, internal-or-external commenting, extensive internal-only revision history, and more.</w:t>
-      </w:r>
-    </w:p>
-    <w:p>
-      <w:pPr>
-        <w:pStyle w:val="Body"/>
-        <w:spacing w:lineRule="auto"/>
-        <w:ind w:left="0"/>
-      </w:pPr>
-    </w:p>
-    <w:p>
-      <w:pPr>
-        <w:pStyle w:val="Body"/>
-        <w:spacing w:lineRule="auto"/>
-        <w:ind w:left="0"/>
-      </w:pPr>
-      <w:r>
-        <w:rPr>
-          <w:color w:val="000000"/>
-          <w:rFonts w:ascii="Arial" w:eastAsia="Arial" w:hAnsi="Arial" w:cs="Arial"/>
-          <w:sz w:val="22"/>
-        </w:rPr>
-        <w:t xml:space="preserve">The team wanted a flexible approach here where all this functionality could be used across different backend providers and configurations, so they created a frontend-only component that is readily pluggable into any backend. Tools or platforms needing collaborative DOCX editing (e.g., building a new invoice app in Salesforce) can then easily leverage the solution with their own server, database, and permissions setup. Keeping the project a frontend-only component ensures the experience is always fast, secure, and easily embedded anywhere (e.g., a new invoicing app someone wants to build into Salesforce). </w:t>
-      </w:r>
-    </w:p>
-    <w:p>
-      <w:pPr>
-        <w:pStyle w:val="Body"/>
-        <w:spacing w:lineRule="auto"/>
-        <w:ind w:left="0"/>
-      </w:pPr>
-    </w:p>
-    <w:p>
-      <w:pPr>
-        <w:pStyle w:val="Body"/>
-        <w:spacing w:lineRule="auto"/>
-        <w:ind w:left="0"/>
-      </w:pPr>
-      <w:r>
-        <w:rPr>
-          <w:i/>
-          <w:color w:val="000000"/>
-          <w:rFonts w:ascii="Arial" w:eastAsia="Arial" w:hAnsi="Arial" w:cs="Arial"/>
-          <w:sz w:val="22"/>
-        </w:rPr>
-        <w:t>Completely extensible</w:t>
-      </w:r>
-    </w:p>
-    <w:p>
-      <w:pPr>
-        <w:pStyle w:val="Body"/>
-        <w:spacing w:lineRule="auto"/>
-        <w:ind w:left="0"/>
-      </w:pPr>
-    </w:p>
-    <w:p>
-      <w:pPr>
-        <w:pStyle w:val="Body"/>
-        <w:spacing w:lineRule="auto"/>
-        <w:ind w:left="0"/>
-      </w:pPr>
-      <w:r>
-        <w:rPr>
-          <w:color w:val="000000"/>
-          <w:rFonts w:ascii="Arial" w:eastAsia="Arial" w:hAnsi="Arial" w:cs="Arial"/>
-          <w:sz w:val="22"/>
-        </w:rPr>
-        <w:t xml:space="preserve">The team at Harbour will also </w:t>
-      </w:r>
-      <w:hyperlink w:history="0" r:id="rId8">
-        <w:r>
-          <w:rPr>
-            <w:color w:val="000000"/>
-            <w:rFonts w:ascii="Arial" w:eastAsia="Arial" w:hAnsi="Arial" w:cs="Arial"/>
-            <w:sz w:val="22"/>
-            <w:rStyle w:val="Hyperlink"/>
-            <w:u w:val="single"/>
-          </w:rPr>
-          <w:t>open source their document editor</w:t>
-        </w:r>
-      </w:hyperlink>
-      <w:r>
-        <w:rPr>
-          <w:color w:val="000000"/>
-          <w:rFonts w:ascii="Arial" w:eastAsia="Arial" w:hAnsi="Arial" w:cs="Arial"/>
-          <w:sz w:val="22"/>
-        </w:rPr>
-        <w:t xml:space="preserve"> for wider community use (and dual-licensed for other commercial uses). The team is excited to build a community around SuperDoc and ensure radical transparency to ensure security given the sensitivity of documents to organizations and truly hopes it uplevels many products. With its modular architecture and truly open nature, it is optimized to be easily extended by the community!</w:t>
-      </w:r>
-    </w:p>
-    <w:p>
-      <w:pPr>
-        <w:pStyle w:val="Body"/>
-        <w:spacing w:lineRule="auto"/>
-        <w:ind w:left="0"/>
-      </w:pPr>
-    </w:p>
-    <w:p>
-      <w:pPr>
-        <w:pStyle w:val="Body"/>
-        <w:spacing w:lineRule="auto"/>
-        <w:ind w:left="0"/>
-      </w:pPr>
-      <w:r>
-        <w:rPr>
-          <w:color w:val="000000"/>
-          <w:rFonts w:ascii="Arial" w:eastAsia="Arial" w:hAnsi="Arial" w:cs="Arial"/>
-          <w:sz w:val="22"/>
-        </w:rPr>
-        <w:t>This truly sets the stage for new and modernized document workflow experiences across the web.</w:t>
-      </w:r>
-    </w:p>
-    <w:p>
-      <w:pPr>
-        <w:pStyle w:val="Body"/>
-        <w:spacing w:lineRule="auto"/>
-        <w:ind w:left="0"/>
-      </w:pPr>
-    </w:p>
-    <w:p>
-      <w:pPr>
-        <w:pStyle w:val="Body"/>
-        <w:spacing w:lineRule="auto"/>
-        <w:ind w:left="0"/>
-      </w:pPr>
-      <w:r>
-        <w:rPr>
-          <w:b/>
-          <w:color w:val="000000"/>
-          <w:rFonts w:ascii="Arial" w:eastAsia="Arial" w:hAnsi="Arial" w:cs="Arial"/>
-          <w:sz w:val="22"/>
-        </w:rPr>
-        <w:t>Technical TLDR</w:t>
-      </w:r>
-    </w:p>
-    <w:p>
-      <w:pPr>
-        <w:spacing w:lineRule="auto"/>
-        <w:ind w:left="0"/>
-      </w:pPr>
-      <w:r>
-        <w:rPr>
-          <w:color w:val="1F2328"/>
-          <w:rFonts w:ascii="Apple Color Emoji" w:eastAsia="Apple Color Emoji" w:hAnsi="Apple Color Emoji" w:cs="Apple Color Emoji"/>
-        </w:rPr>
-        <w:t>✅</w:t>
-      </w:r>
-      <w:r>
-        <w:rPr>
-          <w:color w:val="1F2328"/>
-          <w:rFonts w:ascii="Arial" w:eastAsia="Arial" w:hAnsi="Arial" w:cs="Arial"/>
-        </w:rPr>
-        <w:t xml:space="preserve"> View and edit DOCX natively online</w:t>
-      </w:r>
-    </w:p>
-    <w:p>
-      <w:pPr>
-        <w:spacing w:lineRule="auto"/>
-        <w:ind w:left="0"/>
-      </w:pPr>
-      <w:r>
-        <w:rPr>
-          <w:color w:val="1F2328"/>
-          <w:rFonts w:ascii="Apple Color Emoji" w:eastAsia="Apple Color Emoji" w:hAnsi="Apple Color Emoji" w:cs="Apple Color Emoji"/>
-        </w:rPr>
-        <w:t>✅</w:t>
-      </w:r>
-      <w:r>
-        <w:rPr>
-          <w:color w:val="1F2328"/>
-          <w:rFonts w:ascii="Arial" w:eastAsia="Arial" w:hAnsi="Arial" w:cs="Arial"/>
-        </w:rPr>
-        <w:t xml:space="preserve"> Excellent MS Word compatibility supporting importing/exporting, advanced formatting, comments, tracked changes, and more</w:t>
-      </w:r>
-    </w:p>
-    <w:p>
-      <w:pPr>
-        <w:spacing w:lineRule="auto"/>
-        <w:ind w:left="0"/>
-      </w:pPr>
-      <w:r>
-        <w:rPr>
-          <w:color w:val="1F2328"/>
-          <w:rFonts w:ascii="Apple Color Emoji" w:eastAsia="Apple Color Emoji" w:hAnsi="Apple Color Emoji" w:cs="Apple Color Emoji"/>
-        </w:rPr>
-        <w:t>✅</w:t>
-      </w:r>
-      <w:r>
-        <w:rPr>
-          <w:color w:val="1F2328"/>
-          <w:rFonts w:ascii="Arial" w:eastAsia="Arial" w:hAnsi="Arial" w:cs="Arial"/>
-        </w:rPr>
-        <w:t xml:space="preserve"> Can be entirely self-hosted (with fully in-browser DOCX rendering/editing)</w:t>
-      </w:r>
-    </w:p>
-    <w:p>
-      <w:pPr>
-        <w:spacing w:lineRule="auto"/>
-        <w:ind w:left="0"/>
-      </w:pPr>
-      <w:r>
-        <w:rPr>
-          <w:color w:val="1F2328"/>
-          <w:rFonts w:ascii="Apple Color Emoji" w:eastAsia="Apple Color Emoji" w:hAnsi="Apple Color Emoji" w:cs="Apple Color Emoji"/>
-        </w:rPr>
-        <w:t>✅</w:t>
-      </w:r>
-      <w:r>
-        <w:rPr>
-          <w:color w:val="1F2328"/>
-          <w:rFonts w:ascii="Arial" w:eastAsia="Arial" w:hAnsi="Arial" w:cs="Arial"/>
-        </w:rPr>
-        <w:t xml:space="preserve"> Supports optional real-time collaboration with multiplayer editing, live updates, commenting, sharing, and revision history (and pluggable into any backend)</w:t>
-      </w:r>
-    </w:p>
-    <w:p>
-      <w:pPr>
-        <w:spacing w:lineRule="auto"/>
-        <w:ind w:left="0"/>
-      </w:pPr>
-      <w:r>
-        <w:rPr>
-          <w:color w:val="1F2328"/>
-          <w:rFonts w:ascii="Apple Color Emoji" w:eastAsia="Apple Color Emoji" w:hAnsi="Apple Color Emoji" w:cs="Apple Color Emoji"/>
-        </w:rPr>
-        <w:t>✅</w:t>
-      </w:r>
-      <w:r>
-        <w:rPr>
-          <w:color w:val="1F2328"/>
-          <w:rFonts w:ascii="Arial" w:eastAsia="Arial" w:hAnsi="Arial" w:cs="Arial"/>
-        </w:rPr>
-        <w:t xml:space="preserve"> Integrates well with any frontend JS library: Vue, React, vanilla JS, more</w:t>
-      </w:r>
-    </w:p>
-    <w:p>
-      <w:pPr>
-        <w:spacing w:lineRule="auto"/>
-        <w:ind w:left="0"/>
-      </w:pPr>
-      <w:r>
-        <w:rPr>
-          <w:color w:val="1F2328"/>
-          <w:rFonts w:ascii="Apple Color Emoji" w:eastAsia="Apple Color Emoji" w:hAnsi="Apple Color Emoji" w:cs="Apple Color Emoji"/>
-        </w:rPr>
-        <w:t>✅</w:t>
-      </w:r>
-      <w:r>
-        <w:rPr>
-          <w:color w:val="1F2328"/>
-          <w:rFonts w:ascii="Arial" w:eastAsia="Arial" w:hAnsi="Arial" w:cs="Arial"/>
-        </w:rPr>
-        <w:t xml:space="preserve"> Architected for modularity and easy extensibility</w:t>
-      </w:r>
-    </w:p>
-    <w:p>
-      <w:pPr>
-        <w:spacing w:lineRule="auto"/>
-        <w:ind w:left="0"/>
-      </w:pPr>
-      <w:r>
-        <w:rPr>
-          <w:color w:val="1F2328"/>
-          <w:rFonts w:ascii="Apple Color Emoji" w:eastAsia="Apple Color Emoji" w:hAnsi="Apple Color Emoji" w:cs="Apple Color Emoji"/>
-        </w:rPr>
-        <w:t>✅</w:t>
-      </w:r>
-      <w:r>
-        <w:rPr>
-          <w:color w:val="1F2328"/>
-          <w:rFonts w:ascii="Arial" w:eastAsia="Arial" w:hAnsi="Arial" w:cs="Arial"/>
-        </w:rPr>
-        <w:t xml:space="preserve"> Fully available under both an </w:t>
-      </w:r>
-      <w:r>
-        <w:rPr>
-          <w:rFonts w:ascii="Arial" w:eastAsia="Arial" w:hAnsi="Arial" w:cs="Arial"/>
-        </w:rPr>
-        <w:t>Open Source</w:t>
-      </w:r>
-      <w:r>
-        <w:rPr>
-          <w:rFonts w:ascii="Arial" w:eastAsia="Arial" w:hAnsi="Arial" w:cs="Arial"/>
-        </w:rPr>
-        <w:t xml:space="preserve"> license (AGPLv3) for community use</w:t>
-      </w:r>
-      <w:r>
-        <w:rPr>
-          <w:color w:val="1F2328"/>
-          <w:rFonts w:ascii="Arial" w:eastAsia="Arial" w:hAnsi="Arial" w:cs="Arial"/>
-        </w:rPr>
-        <w:t xml:space="preserve"> and a </w:t>
-      </w:r>
-      <w:r>
-        <w:rPr>
-          <w:rFonts w:ascii="Arial" w:eastAsia="Arial" w:hAnsi="Arial" w:cs="Arial"/>
-        </w:rPr>
-        <w:t>Commercial license for enterprise use</w:t>
-      </w:r>
-    </w:p>
-    <w:p>
-      <w:pPr>
-        <w:spacing w:lineRule="auto"/>
-        <w:ind w:left="0"/>
-      </w:pPr>
-      <w:r>
-        <w:rPr>
-          <w:color w:val="1F2328"/>
-          <w:rFonts w:ascii="Apple Color Emoji" w:eastAsia="Apple Color Emoji" w:hAnsi="Apple Color Emoji" w:cs="Apple Color Emoji"/>
-        </w:rPr>
-        <w:t>✅</w:t>
-      </w:r>
-      <w:r>
-        <w:rPr>
-          <w:color w:val="1F2328"/>
-          <w:rFonts w:ascii="Arial" w:eastAsia="Arial" w:hAnsi="Arial" w:cs="Arial"/>
-        </w:rPr>
-        <w:t xml:space="preserve"> Created and </w:t>
-      </w:r>
-      <w:r>
-        <w:rPr>
-          <w:color w:val="1F2328"/>
-          <w:rFonts w:ascii="Arial" w:eastAsia="Arial" w:hAnsi="Arial" w:cs="Arial"/>
-        </w:rPr>
-        <w:t>actively-developed</w:t>
-      </w:r>
-      <w:r>
-        <w:rPr>
-          <w:color w:val="1F2328"/>
-          <w:rFonts w:ascii="Arial" w:eastAsia="Arial" w:hAnsi="Arial" w:cs="Arial"/>
-        </w:rPr>
-        <w:t xml:space="preserve"> by </w:t>
-      </w:r>
-      <w:r>
-        <w:rPr>
-          <w:rFonts w:ascii="Apple Color Emoji" w:eastAsia="Apple Color Emoji" w:hAnsi="Apple Color Emoji" w:cs="Apple Color Emoji"/>
-        </w:rPr>
-        <w:t>⛵️</w:t>
-      </w:r>
-      <w:r>
-        <w:rPr>
-          <w:rFonts w:ascii="Arial" w:eastAsia="Arial" w:hAnsi="Arial" w:cs="Arial"/>
-        </w:rPr>
-        <w:t>Harbour - Superpowered contract management</w:t>
-      </w:r>
-      <w:r>
-        <w:rPr>
-          <w:color w:val="1F2328"/>
-          <w:rFonts w:ascii="Arial" w:eastAsia="Arial" w:hAnsi="Arial" w:cs="Arial"/>
-        </w:rPr>
-        <w:t xml:space="preserve"> and the SuperDoc community</w:t>
-      </w:r>
-    </w:p>
+    <w:p/>
     <w:sectPr>
-      <w:headerReference w:type="default" r:id="rId9"/>
-      <w:footerReference w:type="default" r:id="rId10"/>
+      <w:headerReference w:type="default" r:id="rId7"/>
+      <w:footerReference w:type="default" r:id="rId8"/>
       <w:pgSz w:w="12240" w:h="15840"/>
       <w:pgMar w:top="1440" w:right="1440" w:bottom="1440" w:left="1440" w:header="720" w:footer="720" w:gutter="0"/>
       <w:pgNumType w:start="1"/>
@@ -840,7 +16,7 @@
 </file>
 
 <file path=word/endnotes.xml><?xml version="1.0" encoding="utf-8"?>
-<w:endnotes xmlns:wpc="http://schemas.microsoft.com/office/word/2010/wordprocessingCanvas" xmlns:cx="http://schemas.microsoft.com/office/drawing/2014/chartex" xmlns:cx1="http://schemas.microsoft.com/office/drawing/2015/9/8/chartex" xmlns:cx2="http://schemas.microsoft.com/office/drawing/2015/10/21/chartex" xmlns:cx3="http://schemas.microsoft.com/office/drawing/2016/5/9/chartex" xmlns:cx4="http://schemas.microsoft.com/office/drawing/2016/5/10/chartex" xmlns:cx5="http://schemas.microsoft.com/office/drawing/2016/5/11/chartex" xmlns:cx6="http://schemas.microsoft.com/office/drawing/2016/5/12/chartex" xmlns:cx7="http://schemas.microsoft.com/office/drawing/2016/5/13/chartex" xmlns:cx8="http://schemas.microsoft.com/office/drawing/2016/5/14/chartex" xmlns:mc="http://schemas.openxmlformats.org/markup-compatibility/2006" xmlns:aink="http://schemas.microsoft.com/office/drawing/2016/ink" xmlns:am3d="http://schemas.microsoft.com/office/drawing/2017/model3d" xmlns:o="urn:schemas-microsoft-com:office:office" xmlns:oel="http://schemas.microsoft.com/office/2019/extlst" xmlns:r="http://schemas.openxmlformats.org/officeDocument/2006/relationships" xmlns:m="http://schemas.openxmlformats.org/officeDocument/2006/math" xmlns:v="urn:schemas-microsoft-com:vml" xmlns:wp14="http://schemas.microsoft.com/office/word/2010/wordprocessingDrawing" xmlns:wp="http://schemas.openxmlformats.org/drawingml/2006/wordprocessingDrawing" xmlns:w10="urn:schemas-microsoft-com:office:word" xmlns:w="http://schemas.openxmlformats.org/wordprocessingml/2006/main" xmlns:w14="http://schemas.microsoft.com/office/word/2010/wordml" xmlns:w15="http://schemas.microsoft.com/office/word/2012/wordml" xmlns:w16cex="http://schemas.microsoft.com/office/word/2018/wordml/cex" xmlns:w16cid="http://schemas.microsoft.com/office/word/2016/wordml/cid" xmlns:w16="http://schemas.microsoft.com/office/word/2018/wordml" xmlns:w16du="http://schemas.microsoft.com/office/word/2023/wordml/word16du" xmlns:w16sdtdh="http://schemas.microsoft.com/office/word/2020/wordml/sdtdatahash" xmlns:w16se="http://schemas.microsoft.com/office/word/2015/wordml/symex" xmlns:wpg="http://schemas.microsoft.com/office/word/2010/wordprocessingGroup" xmlns:wpi="http://schemas.microsoft.com/office/word/2010/wordprocessingInk" xmlns:wne="http://schemas.microsoft.com/office/word/2006/wordml" xmlns:wps="http://schemas.microsoft.com/office/word/2010/wordprocessingShape" mc:Ignorable="w14 w15 w16se w16cid w16 w16cex w16sdtdh w16du wp14">
+<w:endnotes xmlns:wpc="http://schemas.microsoft.com/office/word/2010/wordprocessingCanvas" xmlns:cx="http://schemas.microsoft.com/office/drawing/2014/chartex" xmlns:cx1="http://schemas.microsoft.com/office/drawing/2015/9/8/chartex" xmlns:cx2="http://schemas.microsoft.com/office/drawing/2015/10/21/chartex" xmlns:cx3="http://schemas.microsoft.com/office/drawing/2016/5/9/chartex" xmlns:cx4="http://schemas.microsoft.com/office/drawing/2016/5/10/chartex" xmlns:cx5="http://schemas.microsoft.com/office/drawing/2016/5/11/chartex" xmlns:cx6="http://schemas.microsoft.com/office/drawing/2016/5/12/chartex" xmlns:cx7="http://schemas.microsoft.com/office/drawing/2016/5/13/chartex" xmlns:cx8="http://schemas.microsoft.com/office/drawing/2016/5/14/chartex" xmlns:mc="http://schemas.openxmlformats.org/markup-compatibility/2006" xmlns:aink="http://schemas.microsoft.com/office/drawing/2016/ink" xmlns:am3d="http://schemas.microsoft.com/office/drawing/2017/model3d" xmlns:o="urn:schemas-microsoft-com:office:office" xmlns:oel="http://schemas.microsoft.com/office/2019/extlst" xmlns:r="http://schemas.openxmlformats.org/officeDocument/2006/relationships" xmlns:m="http://schemas.openxmlformats.org/officeDocument/2006/math" xmlns:v="urn:schemas-microsoft-com:vml" xmlns:wp14="http://schemas.microsoft.com/office/word/2010/wordprocessingDrawing" xmlns:wp="http://schemas.openxmlformats.org/drawingml/2006/wordprocessingDrawing" xmlns:w10="urn:schemas-microsoft-com:office:word" xmlns:w="http://schemas.openxmlformats.org/wordprocessingml/2006/main" xmlns:w14="http://schemas.microsoft.com/office/word/2010/wordml" xmlns:w15="http://schemas.microsoft.com/office/word/2012/wordml" xmlns:w16cex="http://schemas.microsoft.com/office/word/2018/wordml/cex" xmlns:w16cid="http://schemas.microsoft.com/office/word/2016/wordml/cid" xmlns:w16="http://schemas.microsoft.com/office/word/2018/wordml" xmlns:w16du="http://schemas.microsoft.com/office/word/2023/wordml/word16du" xmlns:w16sdtdh="http://schemas.microsoft.com/office/word/2020/wordml/sdtdatahash" xmlns:w16sdtfl="http://schemas.microsoft.com/office/word/2024/wordml/sdtformatlock" xmlns:w16se="http://schemas.microsoft.com/office/word/2015/wordml/symex" xmlns:wpg="http://schemas.microsoft.com/office/word/2010/wordprocessingGroup" xmlns:wpi="http://schemas.microsoft.com/office/word/2010/wordprocessingInk" xmlns:wne="http://schemas.microsoft.com/office/word/2006/wordml" xmlns:wps="http://schemas.microsoft.com/office/word/2010/wordprocessingShape" mc:Ignorable="w14 w15 w16se w16cid w16 w16cex w16sdtdh w16sdtfl w16du wp14">
   <w:endnote w:type="separator" w:id="-1">
     <w:p>
       <w:r>
@@ -859,18 +35,13 @@
 </file>
 
 <file path=word/footer1.xml><?xml version="1.0" encoding="utf-8"?>
-<w:ftr xmlns:wpc="http://schemas.microsoft.com/office/word/2010/wordprocessingCanvas" xmlns:cx="http://schemas.microsoft.com/office/drawing/2014/chartex" xmlns:cx1="http://schemas.microsoft.com/office/drawing/2015/9/8/chartex" xmlns:cx2="http://schemas.microsoft.com/office/drawing/2015/10/21/chartex" xmlns:cx3="http://schemas.microsoft.com/office/drawing/2016/5/9/chartex" xmlns:cx4="http://schemas.microsoft.com/office/drawing/2016/5/10/chartex" xmlns:cx5="http://schemas.microsoft.com/office/drawing/2016/5/11/chartex" xmlns:cx6="http://schemas.microsoft.com/office/drawing/2016/5/12/chartex" xmlns:cx7="http://schemas.microsoft.com/office/drawing/2016/5/13/chartex" xmlns:cx8="http://schemas.microsoft.com/office/drawing/2016/5/14/chartex" xmlns:mc="http://schemas.openxmlformats.org/markup-compatibility/2006" xmlns:aink="http://schemas.microsoft.com/office/drawing/2016/ink" xmlns:am3d="http://schemas.microsoft.com/office/drawing/2017/model3d" xmlns:o="urn:schemas-microsoft-com:office:office" xmlns:oel="http://schemas.microsoft.com/office/2019/extlst" xmlns:r="http://schemas.openxmlformats.org/officeDocument/2006/relationships" xmlns:m="http://schemas.openxmlformats.org/officeDocument/2006/math" xmlns:v="urn:schemas-microsoft-com:vml" xmlns:wp14="http://schemas.microsoft.com/office/word/2010/wordprocessingDrawing" xmlns:wp="http://schemas.openxmlformats.org/drawingml/2006/wordprocessingDrawing" xmlns:w10="urn:schemas-microsoft-com:office:word" xmlns:w="http://schemas.openxmlformats.org/wordprocessingml/2006/main" xmlns:w14="http://schemas.microsoft.com/office/word/2010/wordml" xmlns:w15="http://schemas.microsoft.com/office/word/2012/wordml" xmlns:w16cex="http://schemas.microsoft.com/office/word/2018/wordml/cex" xmlns:w16cid="http://schemas.microsoft.com/office/word/2016/wordml/cid" xmlns:w16="http://schemas.microsoft.com/office/word/2018/wordml" xmlns:w16du="http://schemas.microsoft.com/office/word/2023/wordml/word16du" xmlns:w16sdtdh="http://schemas.microsoft.com/office/word/2020/wordml/sdtdatahash" xmlns:w16se="http://schemas.microsoft.com/office/word/2015/wordml/symex" xmlns:wpg="http://schemas.microsoft.com/office/word/2010/wordprocessingGroup" xmlns:wpi="http://schemas.microsoft.com/office/word/2010/wordprocessingInk" xmlns:wne="http://schemas.microsoft.com/office/word/2006/wordml" xmlns:wps="http://schemas.microsoft.com/office/word/2010/wordprocessingShape" mc:Ignorable="w14 w15 w16se w16cid w16 w16cex w16sdtdh w16du wp14">
-  <w:p>
-    <w:pPr>
-      <w:spacing w:lineRule="auto"/>
-      <w:ind w:left="0"/>
-    </w:pPr>
-  </w:p>
+<w:ftr xmlns:wpc="http://schemas.microsoft.com/office/word/2010/wordprocessingCanvas" xmlns:cx="http://schemas.microsoft.com/office/drawing/2014/chartex" xmlns:cx1="http://schemas.microsoft.com/office/drawing/2015/9/8/chartex" xmlns:cx2="http://schemas.microsoft.com/office/drawing/2015/10/21/chartex" xmlns:cx3="http://schemas.microsoft.com/office/drawing/2016/5/9/chartex" xmlns:cx4="http://schemas.microsoft.com/office/drawing/2016/5/10/chartex" xmlns:cx5="http://schemas.microsoft.com/office/drawing/2016/5/11/chartex" xmlns:cx6="http://schemas.microsoft.com/office/drawing/2016/5/12/chartex" xmlns:cx7="http://schemas.microsoft.com/office/drawing/2016/5/13/chartex" xmlns:cx8="http://schemas.microsoft.com/office/drawing/2016/5/14/chartex" xmlns:mc="http://schemas.openxmlformats.org/markup-compatibility/2006" xmlns:aink="http://schemas.microsoft.com/office/drawing/2016/ink" xmlns:am3d="http://schemas.microsoft.com/office/drawing/2017/model3d" xmlns:o="urn:schemas-microsoft-com:office:office" xmlns:oel="http://schemas.microsoft.com/office/2019/extlst" xmlns:r="http://schemas.openxmlformats.org/officeDocument/2006/relationships" xmlns:m="http://schemas.openxmlformats.org/officeDocument/2006/math" xmlns:v="urn:schemas-microsoft-com:vml" xmlns:wp14="http://schemas.microsoft.com/office/word/2010/wordprocessingDrawing" xmlns:wp="http://schemas.openxmlformats.org/drawingml/2006/wordprocessingDrawing" xmlns:w10="urn:schemas-microsoft-com:office:word" xmlns:w="http://schemas.openxmlformats.org/wordprocessingml/2006/main" xmlns:w14="http://schemas.microsoft.com/office/word/2010/wordml" xmlns:w15="http://schemas.microsoft.com/office/word/2012/wordml" xmlns:w16cex="http://schemas.microsoft.com/office/word/2018/wordml/cex" xmlns:w16cid="http://schemas.microsoft.com/office/word/2016/wordml/cid" xmlns:w16="http://schemas.microsoft.com/office/word/2018/wordml" xmlns:w16du="http://schemas.microsoft.com/office/word/2023/wordml/word16du" xmlns:w16sdtdh="http://schemas.microsoft.com/office/word/2020/wordml/sdtdatahash" xmlns:w16sdtfl="http://schemas.microsoft.com/office/word/2024/wordml/sdtformatlock" xmlns:w16se="http://schemas.microsoft.com/office/word/2015/wordml/symex" xmlns:wpg="http://schemas.microsoft.com/office/word/2010/wordprocessingGroup" xmlns:wpi="http://schemas.microsoft.com/office/word/2010/wordprocessingInk" xmlns:wne="http://schemas.microsoft.com/office/word/2006/wordml" xmlns:wps="http://schemas.microsoft.com/office/word/2010/wordprocessingShape" mc:Ignorable="w14 w15 w16se w16cid w16 w16cex w16sdtdh w16sdtfl w16du wp14">
+  <w:p/>
 </w:ftr>
 </file>
 
 <file path=word/footnotes.xml><?xml version="1.0" encoding="utf-8"?>
-<w:footnotes xmlns:wpc="http://schemas.microsoft.com/office/word/2010/wordprocessingCanvas" xmlns:cx="http://schemas.microsoft.com/office/drawing/2014/chartex" xmlns:cx1="http://schemas.microsoft.com/office/drawing/2015/9/8/chartex" xmlns:cx2="http://schemas.microsoft.com/office/drawing/2015/10/21/chartex" xmlns:cx3="http://schemas.microsoft.com/office/drawing/2016/5/9/chartex" xmlns:cx4="http://schemas.microsoft.com/office/drawing/2016/5/10/chartex" xmlns:cx5="http://schemas.microsoft.com/office/drawing/2016/5/11/chartex" xmlns:cx6="http://schemas.microsoft.com/office/drawing/2016/5/12/chartex" xmlns:cx7="http://schemas.microsoft.com/office/drawing/2016/5/13/chartex" xmlns:cx8="http://schemas.microsoft.com/office/drawing/2016/5/14/chartex" xmlns:mc="http://schemas.openxmlformats.org/markup-compatibility/2006" xmlns:aink="http://schemas.microsoft.com/office/drawing/2016/ink" xmlns:am3d="http://schemas.microsoft.com/office/drawing/2017/model3d" xmlns:o="urn:schemas-microsoft-com:office:office" xmlns:oel="http://schemas.microsoft.com/office/2019/extlst" xmlns:r="http://schemas.openxmlformats.org/officeDocument/2006/relationships" xmlns:m="http://schemas.openxmlformats.org/officeDocument/2006/math" xmlns:v="urn:schemas-microsoft-com:vml" xmlns:wp14="http://schemas.microsoft.com/office/word/2010/wordprocessingDrawing" xmlns:wp="http://schemas.openxmlformats.org/drawingml/2006/wordprocessingDrawing" xmlns:w10="urn:schemas-microsoft-com:office:word" xmlns:w="http://schemas.openxmlformats.org/wordprocessingml/2006/main" xmlns:w14="http://schemas.microsoft.com/office/word/2010/wordml" xmlns:w15="http://schemas.microsoft.com/office/word/2012/wordml" xmlns:w16cex="http://schemas.microsoft.com/office/word/2018/wordml/cex" xmlns:w16cid="http://schemas.microsoft.com/office/word/2016/wordml/cid" xmlns:w16="http://schemas.microsoft.com/office/word/2018/wordml" xmlns:w16du="http://schemas.microsoft.com/office/word/2023/wordml/word16du" xmlns:w16sdtdh="http://schemas.microsoft.com/office/word/2020/wordml/sdtdatahash" xmlns:w16se="http://schemas.microsoft.com/office/word/2015/wordml/symex" xmlns:wpg="http://schemas.microsoft.com/office/word/2010/wordprocessingGroup" xmlns:wpi="http://schemas.microsoft.com/office/word/2010/wordprocessingInk" xmlns:wne="http://schemas.microsoft.com/office/word/2006/wordml" xmlns:wps="http://schemas.microsoft.com/office/word/2010/wordprocessingShape" mc:Ignorable="w14 w15 w16se w16cid w16 w16cex w16sdtdh w16du wp14">
+<w:footnotes xmlns:wpc="http://schemas.microsoft.com/office/word/2010/wordprocessingCanvas" xmlns:cx="http://schemas.microsoft.com/office/drawing/2014/chartex" xmlns:cx1="http://schemas.microsoft.com/office/drawing/2015/9/8/chartex" xmlns:cx2="http://schemas.microsoft.com/office/drawing/2015/10/21/chartex" xmlns:cx3="http://schemas.microsoft.com/office/drawing/2016/5/9/chartex" xmlns:cx4="http://schemas.microsoft.com/office/drawing/2016/5/10/chartex" xmlns:cx5="http://schemas.microsoft.com/office/drawing/2016/5/11/chartex" xmlns:cx6="http://schemas.microsoft.com/office/drawing/2016/5/12/chartex" xmlns:cx7="http://schemas.microsoft.com/office/drawing/2016/5/13/chartex" xmlns:cx8="http://schemas.microsoft.com/office/drawing/2016/5/14/chartex" xmlns:mc="http://schemas.openxmlformats.org/markup-compatibility/2006" xmlns:aink="http://schemas.microsoft.com/office/drawing/2016/ink" xmlns:am3d="http://schemas.microsoft.com/office/drawing/2017/model3d" xmlns:o="urn:schemas-microsoft-com:office:office" xmlns:oel="http://schemas.microsoft.com/office/2019/extlst" xmlns:r="http://schemas.openxmlformats.org/officeDocument/2006/relationships" xmlns:m="http://schemas.openxmlformats.org/officeDocument/2006/math" xmlns:v="urn:schemas-microsoft-com:vml" xmlns:wp14="http://schemas.microsoft.com/office/word/2010/wordprocessingDrawing" xmlns:wp="http://schemas.openxmlformats.org/drawingml/2006/wordprocessingDrawing" xmlns:w10="urn:schemas-microsoft-com:office:word" xmlns:w="http://schemas.openxmlformats.org/wordprocessingml/2006/main" xmlns:w14="http://schemas.microsoft.com/office/word/2010/wordml" xmlns:w15="http://schemas.microsoft.com/office/word/2012/wordml" xmlns:w16cex="http://schemas.microsoft.com/office/word/2018/wordml/cex" xmlns:w16cid="http://schemas.microsoft.com/office/word/2016/wordml/cid" xmlns:w16="http://schemas.microsoft.com/office/word/2018/wordml" xmlns:w16du="http://schemas.microsoft.com/office/word/2023/wordml/word16du" xmlns:w16sdtdh="http://schemas.microsoft.com/office/word/2020/wordml/sdtdatahash" xmlns:w16sdtfl="http://schemas.microsoft.com/office/word/2024/wordml/sdtformatlock" xmlns:w16se="http://schemas.microsoft.com/office/word/2015/wordml/symex" xmlns:wpg="http://schemas.microsoft.com/office/word/2010/wordprocessingGroup" xmlns:wpi="http://schemas.microsoft.com/office/word/2010/wordprocessingInk" xmlns:wne="http://schemas.microsoft.com/office/word/2006/wordml" xmlns:wps="http://schemas.microsoft.com/office/word/2010/wordprocessingShape" mc:Ignorable="w14 w15 w16se w16cid w16 w16cex w16sdtdh w16sdtfl w16du wp14">
   <w:footnote w:type="separator" w:id="-1">
     <w:p>
       <w:r>
@@ -889,18 +60,13 @@
 </file>
 
 <file path=word/header1.xml><?xml version="1.0" encoding="utf-8"?>
-<w:hdr xmlns:wpc="http://schemas.microsoft.com/office/word/2010/wordprocessingCanvas" xmlns:cx="http://schemas.microsoft.com/office/drawing/2014/chartex" xmlns:cx1="http://schemas.microsoft.com/office/drawing/2015/9/8/chartex" xmlns:cx2="http://schemas.microsoft.com/office/drawing/2015/10/21/chartex" xmlns:cx3="http://schemas.microsoft.com/office/drawing/2016/5/9/chartex" xmlns:cx4="http://schemas.microsoft.com/office/drawing/2016/5/10/chartex" xmlns:cx5="http://schemas.microsoft.com/office/drawing/2016/5/11/chartex" xmlns:cx6="http://schemas.microsoft.com/office/drawing/2016/5/12/chartex" xmlns:cx7="http://schemas.microsoft.com/office/drawing/2016/5/13/chartex" xmlns:cx8="http://schemas.microsoft.com/office/drawing/2016/5/14/chartex" xmlns:mc="http://schemas.openxmlformats.org/markup-compatibility/2006" xmlns:aink="http://schemas.microsoft.com/office/drawing/2016/ink" xmlns:am3d="http://schemas.microsoft.com/office/drawing/2017/model3d" xmlns:o="urn:schemas-microsoft-com:office:office" xmlns:oel="http://schemas.microsoft.com/office/2019/extlst" xmlns:r="http://schemas.openxmlformats.org/officeDocument/2006/relationships" xmlns:m="http://schemas.openxmlformats.org/officeDocument/2006/math" xmlns:v="urn:schemas-microsoft-com:vml" xmlns:wp14="http://schemas.microsoft.com/office/word/2010/wordprocessingDrawing" xmlns:wp="http://schemas.openxmlformats.org/drawingml/2006/wordprocessingDrawing" xmlns:w10="urn:schemas-microsoft-com:office:word" xmlns:w="http://schemas.openxmlformats.org/wordprocessingml/2006/main" xmlns:w14="http://schemas.microsoft.com/office/word/2010/wordml" xmlns:w15="http://schemas.microsoft.com/office/word/2012/wordml" xmlns:w16cex="http://schemas.microsoft.com/office/word/2018/wordml/cex" xmlns:w16cid="http://schemas.microsoft.com/office/word/2016/wordml/cid" xmlns:w16="http://schemas.microsoft.com/office/word/2018/wordml" xmlns:w16du="http://schemas.microsoft.com/office/word/2023/wordml/word16du" xmlns:w16sdtdh="http://schemas.microsoft.com/office/word/2020/wordml/sdtdatahash" xmlns:w16se="http://schemas.microsoft.com/office/word/2015/wordml/symex" xmlns:wpg="http://schemas.microsoft.com/office/word/2010/wordprocessingGroup" xmlns:wpi="http://schemas.microsoft.com/office/word/2010/wordprocessingInk" xmlns:wne="http://schemas.microsoft.com/office/word/2006/wordml" xmlns:wps="http://schemas.microsoft.com/office/word/2010/wordprocessingShape" mc:Ignorable="w14 w15 w16se w16cid w16 w16cex w16sdtdh w16du wp14">
-  <w:p>
-    <w:pPr>
-      <w:spacing w:lineRule="auto"/>
-      <w:ind w:left="0"/>
-    </w:pPr>
-  </w:p>
+<w:hdr xmlns:wpc="http://schemas.microsoft.com/office/word/2010/wordprocessingCanvas" xmlns:cx="http://schemas.microsoft.com/office/drawing/2014/chartex" xmlns:cx1="http://schemas.microsoft.com/office/drawing/2015/9/8/chartex" xmlns:cx2="http://schemas.microsoft.com/office/drawing/2015/10/21/chartex" xmlns:cx3="http://schemas.microsoft.com/office/drawing/2016/5/9/chartex" xmlns:cx4="http://schemas.microsoft.com/office/drawing/2016/5/10/chartex" xmlns:cx5="http://schemas.microsoft.com/office/drawing/2016/5/11/chartex" xmlns:cx6="http://schemas.microsoft.com/office/drawing/2016/5/12/chartex" xmlns:cx7="http://schemas.microsoft.com/office/drawing/2016/5/13/chartex" xmlns:cx8="http://schemas.microsoft.com/office/drawing/2016/5/14/chartex" xmlns:mc="http://schemas.openxmlformats.org/markup-compatibility/2006" xmlns:aink="http://schemas.microsoft.com/office/drawing/2016/ink" xmlns:am3d="http://schemas.microsoft.com/office/drawing/2017/model3d" xmlns:o="urn:schemas-microsoft-com:office:office" xmlns:oel="http://schemas.microsoft.com/office/2019/extlst" xmlns:r="http://schemas.openxmlformats.org/officeDocument/2006/relationships" xmlns:m="http://schemas.openxmlformats.org/officeDocument/2006/math" xmlns:v="urn:schemas-microsoft-com:vml" xmlns:wp14="http://schemas.microsoft.com/office/word/2010/wordprocessingDrawing" xmlns:wp="http://schemas.openxmlformats.org/drawingml/2006/wordprocessingDrawing" xmlns:w10="urn:schemas-microsoft-com:office:word" xmlns:w="http://schemas.openxmlformats.org/wordprocessingml/2006/main" xmlns:w14="http://schemas.microsoft.com/office/word/2010/wordml" xmlns:w15="http://schemas.microsoft.com/office/word/2012/wordml" xmlns:w16cex="http://schemas.microsoft.com/office/word/2018/wordml/cex" xmlns:w16cid="http://schemas.microsoft.com/office/word/2016/wordml/cid" xmlns:w16="http://schemas.microsoft.com/office/word/2018/wordml" xmlns:w16du="http://schemas.microsoft.com/office/word/2023/wordml/word16du" xmlns:w16sdtdh="http://schemas.microsoft.com/office/word/2020/wordml/sdtdatahash" xmlns:w16sdtfl="http://schemas.microsoft.com/office/word/2024/wordml/sdtformatlock" xmlns:w16se="http://schemas.microsoft.com/office/word/2015/wordml/symex" xmlns:wpg="http://schemas.microsoft.com/office/word/2010/wordprocessingGroup" xmlns:wpi="http://schemas.microsoft.com/office/word/2010/wordprocessingInk" xmlns:wne="http://schemas.microsoft.com/office/word/2006/wordml" xmlns:wps="http://schemas.microsoft.com/office/word/2010/wordprocessingShape" mc:Ignorable="w14 w15 w16se w16cid w16 w16cex w16sdtdh w16sdtfl w16du wp14">
+  <w:p/>
 </w:hdr>
 </file>
 
 <file path=word/numbering.xml><?xml version="1.0" encoding="utf-8"?>
-<w:numbering xmlns:wpc="http://schemas.microsoft.com/office/word/2010/wordprocessingCanvas" xmlns:cx="http://schemas.microsoft.com/office/drawing/2014/chartex" xmlns:cx1="http://schemas.microsoft.com/office/drawing/2015/9/8/chartex" xmlns:cx2="http://schemas.microsoft.com/office/drawing/2015/10/21/chartex" xmlns:cx3="http://schemas.microsoft.com/office/drawing/2016/5/9/chartex" xmlns:cx4="http://schemas.microsoft.com/office/drawing/2016/5/10/chartex" xmlns:cx5="http://schemas.microsoft.com/office/drawing/2016/5/11/chartex" xmlns:cx6="http://schemas.microsoft.com/office/drawing/2016/5/12/chartex" xmlns:cx7="http://schemas.microsoft.com/office/drawing/2016/5/13/chartex" xmlns:cx8="http://schemas.microsoft.com/office/drawing/2016/5/14/chartex" xmlns:mc="http://schemas.openxmlformats.org/markup-compatibility/2006" xmlns:aink="http://schemas.microsoft.com/office/drawing/2016/ink" xmlns:am3d="http://schemas.microsoft.com/office/drawing/2017/model3d" xmlns:o="urn:schemas-microsoft-com:office:office" xmlns:oel="http://schemas.microsoft.com/office/2019/extlst" xmlns:r="http://schemas.openxmlformats.org/officeDocument/2006/relationships" xmlns:m="http://schemas.openxmlformats.org/officeDocument/2006/math" xmlns:v="urn:schemas-microsoft-com:vml" xmlns:wp14="http://schemas.microsoft.com/office/word/2010/wordprocessingDrawing" xmlns:wp="http://schemas.openxmlformats.org/drawingml/2006/wordprocessingDrawing" xmlns:w10="urn:schemas-microsoft-com:office:word" xmlns:w="http://schemas.openxmlformats.org/wordprocessingml/2006/main" xmlns:w14="http://schemas.microsoft.com/office/word/2010/wordml" xmlns:w15="http://schemas.microsoft.com/office/word/2012/wordml" xmlns:w16cex="http://schemas.microsoft.com/office/word/2018/wordml/cex" xmlns:w16cid="http://schemas.microsoft.com/office/word/2016/wordml/cid" xmlns:w16="http://schemas.microsoft.com/office/word/2018/wordml" xmlns:w16du="http://schemas.microsoft.com/office/word/2023/wordml/word16du" xmlns:w16sdtdh="http://schemas.microsoft.com/office/word/2020/wordml/sdtdatahash" xmlns:w16se="http://schemas.microsoft.com/office/word/2015/wordml/symex" xmlns:wpg="http://schemas.microsoft.com/office/word/2010/wordprocessingGroup" xmlns:wpi="http://schemas.microsoft.com/office/word/2010/wordprocessingInk" xmlns:wne="http://schemas.microsoft.com/office/word/2006/wordml" xmlns:wps="http://schemas.microsoft.com/office/word/2010/wordprocessingShape" mc:Ignorable="w14 w15 w16se w16cid w16 w16cex w16sdtdh w16du wp14">
+<w:numbering xmlns:wpc="http://schemas.microsoft.com/office/word/2010/wordprocessingCanvas" xmlns:cx="http://schemas.microsoft.com/office/drawing/2014/chartex" xmlns:cx1="http://schemas.microsoft.com/office/drawing/2015/9/8/chartex" xmlns:cx2="http://schemas.microsoft.com/office/drawing/2015/10/21/chartex" xmlns:cx3="http://schemas.microsoft.com/office/drawing/2016/5/9/chartex" xmlns:cx4="http://schemas.microsoft.com/office/drawing/2016/5/10/chartex" xmlns:cx5="http://schemas.microsoft.com/office/drawing/2016/5/11/chartex" xmlns:cx6="http://schemas.microsoft.com/office/drawing/2016/5/12/chartex" xmlns:cx7="http://schemas.microsoft.com/office/drawing/2016/5/13/chartex" xmlns:cx8="http://schemas.microsoft.com/office/drawing/2016/5/14/chartex" xmlns:mc="http://schemas.openxmlformats.org/markup-compatibility/2006" xmlns:aink="http://schemas.microsoft.com/office/drawing/2016/ink" xmlns:am3d="http://schemas.microsoft.com/office/drawing/2017/model3d" xmlns:o="urn:schemas-microsoft-com:office:office" xmlns:oel="http://schemas.microsoft.com/office/2019/extlst" xmlns:r="http://schemas.openxmlformats.org/officeDocument/2006/relationships" xmlns:m="http://schemas.openxmlformats.org/officeDocument/2006/math" xmlns:v="urn:schemas-microsoft-com:vml" xmlns:wp14="http://schemas.microsoft.com/office/word/2010/wordprocessingDrawing" xmlns:wp="http://schemas.openxmlformats.org/drawingml/2006/wordprocessingDrawing" xmlns:w10="urn:schemas-microsoft-com:office:word" xmlns:w="http://schemas.openxmlformats.org/wordprocessingml/2006/main" xmlns:w14="http://schemas.microsoft.com/office/word/2010/wordml" xmlns:w15="http://schemas.microsoft.com/office/word/2012/wordml" xmlns:w16cex="http://schemas.microsoft.com/office/word/2018/wordml/cex" xmlns:w16cid="http://schemas.microsoft.com/office/word/2016/wordml/cid" xmlns:w16="http://schemas.microsoft.com/office/word/2018/wordml" xmlns:w16du="http://schemas.microsoft.com/office/word/2023/wordml/word16du" xmlns:w16sdtdh="http://schemas.microsoft.com/office/word/2020/wordml/sdtdatahash" xmlns:w16sdtfl="http://schemas.microsoft.com/office/word/2024/wordml/sdtformatlock" xmlns:w16se="http://schemas.microsoft.com/office/word/2015/wordml/symex" xmlns:wpg="http://schemas.microsoft.com/office/word/2010/wordprocessingGroup" xmlns:wpi="http://schemas.microsoft.com/office/word/2010/wordprocessingInk" xmlns:wne="http://schemas.microsoft.com/office/word/2006/wordml" xmlns:wps="http://schemas.microsoft.com/office/word/2010/wordprocessingShape" mc:Ignorable="w14 w15 w16se w16cid w16 w16cex w16sdtdh w16sdtfl w16du wp14">
   <w:abstractNum w:abstractNumId="0" w15:restartNumberingAfterBreak="0">
     <w:nsid w:val="2E30273A"/>
     <w:multiLevelType w:val="hybridMultilevel"/>
@@ -1195,7 +361,7 @@
 </file>
 
 <file path=word/styles.xml><?xml version="1.0" encoding="utf-8"?>
-<w:styles xmlns:mc="http://schemas.openxmlformats.org/markup-compatibility/2006" xmlns:r="http://schemas.openxmlformats.org/officeDocument/2006/relationships" xmlns:w="http://schemas.openxmlformats.org/wordprocessingml/2006/main" xmlns:w14="http://schemas.microsoft.com/office/word/2010/wordml" xmlns:w15="http://schemas.microsoft.com/office/word/2012/wordml" xmlns:w16cex="http://schemas.microsoft.com/office/word/2018/wordml/cex" xmlns:w16cid="http://schemas.microsoft.com/office/word/2016/wordml/cid" xmlns:w16="http://schemas.microsoft.com/office/word/2018/wordml" xmlns:w16du="http://schemas.microsoft.com/office/word/2023/wordml/word16du" xmlns:w16sdtdh="http://schemas.microsoft.com/office/word/2020/wordml/sdtdatahash" xmlns:w16se="http://schemas.microsoft.com/office/word/2015/wordml/symex" mc:Ignorable="w14 w15 w16se w16cid w16 w16cex w16sdtdh w16du">
+<w:styles xmlns:mc="http://schemas.openxmlformats.org/markup-compatibility/2006" xmlns:r="http://schemas.openxmlformats.org/officeDocument/2006/relationships" xmlns:w="http://schemas.openxmlformats.org/wordprocessingml/2006/main" xmlns:w14="http://schemas.microsoft.com/office/word/2010/wordml" xmlns:w15="http://schemas.microsoft.com/office/word/2012/wordml" xmlns:w16cex="http://schemas.microsoft.com/office/word/2018/wordml/cex" xmlns:w16cid="http://schemas.microsoft.com/office/word/2016/wordml/cid" xmlns:w16="http://schemas.microsoft.com/office/word/2018/wordml" xmlns:w16du="http://schemas.microsoft.com/office/word/2023/wordml/word16du" xmlns:w16sdtdh="http://schemas.microsoft.com/office/word/2020/wordml/sdtdatahash" xmlns:w16sdtfl="http://schemas.microsoft.com/office/word/2024/wordml/sdtformatlock" xmlns:w16se="http://schemas.microsoft.com/office/word/2015/wordml/symex" mc:Ignorable="w14 w15 w16se w16cid w16 w16cex w16sdtdh w16sdtfl w16du">
   <w:docDefaults>
     <w:rPrDefault>
       <w:rPr>
@@ -1700,7 +866,7 @@
       <w:u w:val="single"/>
     </w:rPr>
   </w:style>
-  <w:style w:type="paragraph" w:customStyle="1" w:styleId="HeaderampampFooter">
+  <w:style w:type="paragraph" w:customStyle="1" w:styleId="HeaderampampampFooter">
     <w:name w:val="Header &amp;amp;amp;amp; Footer"/>
     <w:pPr>
       <w:tabs>

</xml_diff>